<commit_message>
Update technical doc with v1.1.0 changes: static resource architecture, new-tab navigation
Co-Authored-By: Claude Opus 4.6 <noreply@anthropic.com>
</commit_message>
<xml_diff>
--- a/Voice_Navigator_Technical_Setup_Guide.docx
+++ b/Voice_Navigator_Technical_Setup_Guide.docx
@@ -39,7 +39,7 @@
           <w:color w:val="888888"/>
           <w:sz w:val="22"/>
         </w:rPr>
-        <w:t>Version 0.1.0.2  |  Released  |  API Version 59.0</w:t>
+        <w:t>Version 1.1.0  |  Released  |  API Version 59.0</w:t>
       </w:r>
     </w:p>
     <w:p/>
@@ -54,7 +54,7 @@
         </w:rPr>
         <w:t>Package Install URL (Production):</w:t>
         <w:br/>
-        <w:t>https://login.salesforce.com/packaging/installPackage.apexp?p0=04tJ1000000t3WRIAY</w:t>
+        <w:t>https://login.salesforce.com/packaging/installPackage.apexp?p0=04tJ1000000t3WbIAI</w:t>
       </w:r>
     </w:p>
     <w:p>
@@ -68,7 +68,7 @@
         </w:rPr>
         <w:t>Package Install URL (Sandbox):</w:t>
         <w:br/>
-        <w:t>https://test.salesforce.com/packaging/installPackage.apexp?p0=04tJ1000000t3WRIAY</w:t>
+        <w:t>https://test.salesforce.com/packaging/installPackage.apexp?p0=04tJ1000000t3WbIAI</w:t>
       </w:r>
     </w:p>
     <w:p>
@@ -351,7 +351,35 @@
               <w:rPr>
                 <w:sz w:val="20"/>
               </w:rPr>
-              <w:t>04tJ1000000t3WRIAY</w:t>
+              <w:t>04tJ1000000t3WbIAI</w:t>
+            </w:r>
+          </w:p>
+        </w:tc>
+      </w:tr>
+      <w:tr>
+        <w:tc>
+          <w:tcPr>
+            <w:tcW w:type="dxa" w:w="4320"/>
+          </w:tcPr>
+          <w:p>
+            <w:r>
+              <w:rPr>
+                <w:sz w:val="20"/>
+              </w:rPr>
+              <w:t>Version</w:t>
+            </w:r>
+          </w:p>
+        </w:tc>
+        <w:tc>
+          <w:tcPr>
+            <w:tcW w:type="dxa" w:w="4320"/>
+          </w:tcPr>
+          <w:p>
+            <w:r>
+              <w:rPr>
+                <w:sz w:val="20"/>
+              </w:rPr>
+              <w:t>1.1.0 (Released)</w:t>
             </w:r>
           </w:p>
         </w:tc>
@@ -379,7 +407,7 @@
               <w:rPr>
                 <w:sz w:val="20"/>
               </w:rPr>
-              <w:t>Released (Production-ready)</w:t>
+              <w:t>Production-ready</w:t>
             </w:r>
           </w:p>
         </w:tc>
@@ -524,6 +552,34 @@
           </w:p>
         </w:tc>
       </w:tr>
+      <w:tr>
+        <w:tc>
+          <w:tcPr>
+            <w:tcW w:type="dxa" w:w="4320"/>
+          </w:tcPr>
+          <w:p>
+            <w:r>
+              <w:rPr>
+                <w:sz w:val="20"/>
+              </w:rPr>
+              <w:t>Navigation Behavior</w:t>
+            </w:r>
+          </w:p>
+        </w:tc>
+        <w:tc>
+          <w:tcPr>
+            <w:tcW w:type="dxa" w:w="4320"/>
+          </w:tcPr>
+          <w:p>
+            <w:r>
+              <w:rPr>
+                <w:sz w:val="20"/>
+              </w:rPr>
+              <w:t>Opens pages in new tab (utility bar stays open)</w:t>
+            </w:r>
+          </w:p>
+        </w:tc>
+      </w:tr>
     </w:tbl>
     <w:p/>
     <w:p>
@@ -572,7 +628,7 @@
         <w:br/>
         <w:t>|  |  - Command parsing engine  |&lt;&gt;|                            |  |</w:t>
         <w:br/>
-        <w:t>|  |  - Navigation logic        |  |  - getObjectApiNames()    |  |</w:t>
+        <w:t>|  |  - Navigation (new tab)    |  |  - getObjectApiNames()    |  |</w:t>
         <w:br/>
         <w:t>|  |  - Fuzzy matching          |  |  - getObjectFields()      |  |</w:t>
         <w:br/>
@@ -586,13 +642,17 @@
         <w:br/>
         <w:t>|  +----------------------------+  +----------------------------+  |</w:t>
         <w:br/>
-        <w:t>|  |  VF: VoiceRecognitionPage  |  |  Salesforce Database       |  |</w:t>
+        <w:t>|  |  Static Resource:          |  |  Salesforce Database       |  |</w:t>
         <w:br/>
-        <w:t>|  |  (Hidden iframe)           |  |  - Standard Objects        |  |</w:t>
+        <w:t>|  |  VoiceRecognitionSR        |  |  - Standard Objects        |  |</w:t>
         <w:br/>
-        <w:t>|  |  - Web Speech API          |  |  - Custom Objects          |  |</w:t>
+        <w:t>|  |  (Hidden iframe,           |  |  - Custom Objects          |  |</w:t>
         <w:br/>
-        <w:t>|  |  - SpeechSynthesis API     |  |  - Record Search           |  |</w:t>
+        <w:t>|  |   same-origin, no CSP)     |  |  - Record Search           |  |</w:t>
+        <w:br/>
+        <w:t>|  |  - Web Speech API          |  |                            |  |</w:t>
+        <w:br/>
+        <w:t>|  |  - SpeechSynthesis API     |  |                            |  |</w:t>
         <w:br/>
         <w:t>|  +----------------------------+  +----------------------------+  |</w:t>
         <w:br/>
@@ -611,17 +671,17 @@
       <w:r>
         <w:t>1. User clicks microphone button (or presses Option+Space / Ctrl+Space)</w:t>
         <w:br/>
-        <w:t>2. LWC sends "start" message to hidden Visualforce iframe via postMessage</w:t>
+        <w:t>2. LWC sends "start" message to hidden Static Resource iframe via postMessage</w:t>
         <w:br/>
-        <w:t>3. VF page activates Web Speech API and captures microphone audio</w:t>
+        <w:t>3. Static resource activates Web Speech API and captures microphone audio</w:t>
         <w:br/>
         <w:t>4. Browser processes speech and returns transcript + confidence score</w:t>
         <w:br/>
-        <w:t>5. VF page sends transcript back to LWC via postMessage</w:t>
+        <w:t>5. Static resource sends transcript back to LWC via postMessage</w:t>
         <w:br/>
         <w:t>6. LWC command parser matches the transcript against known commands</w:t>
         <w:br/>
-        <w:t>7. Navigation executes (page redirect, search, or record creation)</w:t>
+        <w:t>7. Navigation opens target page in a NEW TAB (utility bar stays open)</w:t>
         <w:br/>
         <w:t>8. Voice feedback speaks confirmation via SpeechSynthesis API</w:t>
       </w:r>
@@ -631,12 +691,12 @@
         <w:pStyle w:val="Heading2"/>
       </w:pPr>
       <w:r>
-        <w:t>Why a Visualforce Page?</w:t>
+        <w:t>Why a Static Resource (not Visualforce)?</w:t>
       </w:r>
     </w:p>
     <w:p>
       <w:r>
-        <w:t>Salesforce's Locker Service (security sandbox for LWC) blocks direct access to the browser's Web Speech API. The Visualforce page runs outside this sandbox and communicates with the LWC via the standard postMessage API. This is a supported workaround for browser API restrictions.</w:t>
+        <w:t>Salesforce's Locker Service (security sandbox for LWC) blocks direct access to the browser's Web Speech API. The speech recognition code runs in a hidden iframe loaded from a Static Resource. Unlike Visualforce pages, static resources are served from the same origin as Lightning, which eliminates Content Security Policy (CSP) framing errors that occur in sandboxes. No security settings need to be changed — it works out of the box in all orgs.</w:t>
       </w:r>
     </w:p>
     <w:p>
@@ -1455,7 +1515,160 @@
         <w:pStyle w:val="Heading2"/>
       </w:pPr>
       <w:r>
-        <w:t>3.4 Visualforce Page: VoiceRecognitionPage</w:t>
+        <w:t>3.4 Static Resource: VoiceRecognitionSR (Speech Engine)</w:t>
+      </w:r>
+    </w:p>
+    <w:tbl>
+      <w:tblPr>
+        <w:tblStyle w:val="LightGrid-Accent1"/>
+        <w:tblW w:type="auto" w:w="0"/>
+        <w:jc w:val="left"/>
+        <w:tblLook w:firstColumn="1" w:firstRow="1" w:lastColumn="0" w:lastRow="0" w:noHBand="0" w:noVBand="1" w:val="04A0"/>
+      </w:tblPr>
+      <w:tblGrid>
+        <w:gridCol w:w="2880"/>
+        <w:gridCol w:w="2880"/>
+        <w:gridCol w:w="2880"/>
+      </w:tblGrid>
+      <w:tr>
+        <w:tc>
+          <w:tcPr>
+            <w:tcW w:type="dxa" w:w="2880"/>
+          </w:tcPr>
+          <w:p>
+            <w:r>
+              <w:rPr>
+                <w:b/>
+                <w:sz w:val="20"/>
+              </w:rPr>
+              <w:t>File</w:t>
+            </w:r>
+          </w:p>
+        </w:tc>
+        <w:tc>
+          <w:tcPr>
+            <w:tcW w:type="dxa" w:w="2880"/>
+          </w:tcPr>
+          <w:p>
+            <w:r>
+              <w:rPr>
+                <w:b/>
+                <w:sz w:val="20"/>
+              </w:rPr>
+              <w:t>Size</w:t>
+            </w:r>
+          </w:p>
+        </w:tc>
+        <w:tc>
+          <w:tcPr>
+            <w:tcW w:type="dxa" w:w="2880"/>
+          </w:tcPr>
+          <w:p>
+            <w:r>
+              <w:rPr>
+                <w:b/>
+                <w:sz w:val="20"/>
+              </w:rPr>
+              <w:t>Purpose</w:t>
+            </w:r>
+          </w:p>
+        </w:tc>
+      </w:tr>
+      <w:tr>
+        <w:tc>
+          <w:tcPr>
+            <w:tcW w:type="dxa" w:w="2880"/>
+          </w:tcPr>
+          <w:p>
+            <w:r>
+              <w:rPr>
+                <w:sz w:val="20"/>
+              </w:rPr>
+              <w:t>VoiceRecognitionSR.html</w:t>
+            </w:r>
+          </w:p>
+        </w:tc>
+        <w:tc>
+          <w:tcPr>
+            <w:tcW w:type="dxa" w:w="2880"/>
+          </w:tcPr>
+          <w:p>
+            <w:r>
+              <w:rPr>
+                <w:sz w:val="20"/>
+              </w:rPr>
+              <w:t>3.2 KB</w:t>
+            </w:r>
+          </w:p>
+        </w:tc>
+        <w:tc>
+          <w:tcPr>
+            <w:tcW w:type="dxa" w:w="2880"/>
+          </w:tcPr>
+          <w:p>
+            <w:r>
+              <w:rPr>
+                <w:sz w:val="20"/>
+              </w:rPr>
+              <w:t>Speech recognition engine — Web Speech API + SpeechSynthesis in hidden iframe</w:t>
+            </w:r>
+          </w:p>
+        </w:tc>
+      </w:tr>
+      <w:tr>
+        <w:tc>
+          <w:tcPr>
+            <w:tcW w:type="dxa" w:w="2880"/>
+          </w:tcPr>
+          <w:p>
+            <w:r>
+              <w:rPr>
+                <w:sz w:val="20"/>
+              </w:rPr>
+              <w:t>VoiceRecognitionSR.resource-meta.xml</w:t>
+            </w:r>
+          </w:p>
+        </w:tc>
+        <w:tc>
+          <w:tcPr>
+            <w:tcW w:type="dxa" w:w="2880"/>
+          </w:tcPr>
+          <w:p>
+            <w:r>
+              <w:rPr>
+                <w:sz w:val="20"/>
+              </w:rPr>
+              <w:t>200 B</w:t>
+            </w:r>
+          </w:p>
+        </w:tc>
+        <w:tc>
+          <w:tcPr>
+            <w:tcW w:type="dxa" w:w="2880"/>
+          </w:tcPr>
+          <w:p>
+            <w:r>
+              <w:rPr>
+                <w:sz w:val="20"/>
+              </w:rPr>
+              <w:t>Metadata (contentType: text/html, cacheControl: Public)</w:t>
+            </w:r>
+          </w:p>
+        </w:tc>
+      </w:tr>
+    </w:tbl>
+    <w:p/>
+    <w:p>
+      <w:r>
+        <w:t>This static resource replaced the original Visualforce page (VoiceRecognitionPage) to eliminate CSP framing errors in sandboxes. The VF page is still included in the package for backward compatibility but is no longer used.</w:t>
+      </w:r>
+    </w:p>
+    <w:p>
+      <w:pPr>
+        <w:pStyle w:val="Heading2"/>
+      </w:pPr>
+      <w:r>
+        <w:t>3.5 Visualforce Page: VoiceRecognitionPage (Legacy)</w:t>
       </w:r>
     </w:p>
     <w:tbl>
@@ -1550,7 +1763,7 @@
               <w:rPr>
                 <w:sz w:val="20"/>
               </w:rPr>
-              <w:t>Speech recognition bridge — hosts Web Speech API in hidden iframe</w:t>
+              <w:t>Legacy speech recognition bridge — replaced by VoiceRecognitionSR</w:t>
             </w:r>
           </w:p>
         </w:tc>
@@ -1600,7 +1813,7 @@
     <w:p/>
     <w:p>
       <w:r>
-        <w:t>Communication Protocol (LWC and Visualforce):</w:t>
+        <w:t>Communication Protocol (LWC and Static Resource iframe):</w:t>
       </w:r>
     </w:p>
     <w:tbl>
@@ -1912,7 +2125,7 @@
         <w:pStyle w:val="Heading2"/>
       </w:pPr>
       <w:r>
-        <w:t>3.5 Complete File Structure</w:t>
+        <w:t>3.6 Complete File Structure</w:t>
       </w:r>
     </w:p>
     <w:p>
@@ -1964,9 +2177,15 @@
         <w:br/>
         <w:t xml:space="preserve">    │   └── voiceNavigator.js-meta.xml           # Component metadata</w:t>
         <w:br/>
+        <w:t xml:space="preserve">    ├── staticresources/</w:t>
+        <w:br/>
+        <w:t xml:space="preserve">    │   ├── VoiceRecognitionSR.html              # Speech engine (static resource)</w:t>
+        <w:br/>
+        <w:t xml:space="preserve">    │   └── VoiceRecognitionSR.resource-meta.xml</w:t>
+        <w:br/>
         <w:t xml:space="preserve">    └── pages/</w:t>
         <w:br/>
-        <w:t xml:space="preserve">        ├── VoiceRecognitionPage.page            # Speech API bridge</w:t>
+        <w:t xml:space="preserve">        ├── VoiceRecognitionPage.page            # Legacy speech bridge (unused)</w:t>
         <w:br/>
         <w:t xml:space="preserve">        └── VoiceRecognitionPage.page-meta.xml</w:t>
       </w:r>
@@ -2018,7 +2237,7 @@
           <w:color w:val="333333"/>
           <w:sz w:val="18"/>
         </w:rPr>
-        <w:t>https://login.salesforce.com/packaging/installPackage.apexp?p0=04tJ1000000t3WRIAY</w:t>
+        <w:t>https://login.salesforce.com/packaging/installPackage.apexp?p0=04tJ1000000t3WbIAI</w:t>
       </w:r>
     </w:p>
     <w:p>
@@ -2037,7 +2256,7 @@
           <w:color w:val="333333"/>
           <w:sz w:val="18"/>
         </w:rPr>
-        <w:t>https://test.salesforce.com/packaging/installPackage.apexp?p0=04tJ1000000t3WRIAY</w:t>
+        <w:t>https://test.salesforce.com/packaging/installPackage.apexp?p0=04tJ1000000t3WbIAI</w:t>
       </w:r>
     </w:p>
     <w:p>
@@ -2056,7 +2275,7 @@
           <w:color w:val="333333"/>
           <w:sz w:val="18"/>
         </w:rPr>
-        <w:t>sf package install --package 04tJ1000000t3WRIAY --target-org &lt;org-alias&gt; --wait 10</w:t>
+        <w:t>sf package install --package 04tJ1000000t3WbIAI --target-org &lt;org-alias&gt; --wait 10</w:t>
       </w:r>
     </w:p>
     <w:p>
@@ -2273,6 +2492,34 @@
                 <w:sz w:val="20"/>
               </w:rPr>
               <w:t>voiceNavigator</w:t>
+            </w:r>
+          </w:p>
+        </w:tc>
+      </w:tr>
+      <w:tr>
+        <w:tc>
+          <w:tcPr>
+            <w:tcW w:type="dxa" w:w="4320"/>
+          </w:tcPr>
+          <w:p>
+            <w:r>
+              <w:rPr>
+                <w:sz w:val="20"/>
+              </w:rPr>
+              <w:t>Static Resource</w:t>
+            </w:r>
+          </w:p>
+        </w:tc>
+        <w:tc>
+          <w:tcPr>
+            <w:tcW w:type="dxa" w:w="4320"/>
+          </w:tcPr>
+          <w:p>
+            <w:r>
+              <w:rPr>
+                <w:sz w:val="20"/>
+              </w:rPr>
+              <w:t>VoiceRecognitionSR</w:t>
             </w:r>
           </w:p>
         </w:tc>

</xml_diff>